<commit_message>
Updated resume content and added download / export PDF file of my resume
</commit_message>
<xml_diff>
--- a/Resume - Christopher Lee Cajes.docx
+++ b/Resume - Christopher Lee Cajes.docx
@@ -1716,6 +1716,124 @@
     </w:p>
     <w:p>
       <w:pPr>
+        <w:rPr>
+          <w:noProof/>
+        </w:rPr>
+      </w:pPr>
+    </w:p>
+    <w:p>
+      <w:pPr>
+        <w:rPr>
+          <w:b/>
+          <w:bCs/>
+          <w:noProof/>
+        </w:rPr>
+      </w:pPr>
+      <w:r>
+        <w:rPr>
+          <w:b/>
+          <w:bCs/>
+          <w:noProof/>
+        </w:rPr>
+        <w:t xml:space="preserve">La-Fierce </w:t>
+      </w:r>
+      <w:r>
+        <w:rPr>
+          <w:b/>
+          <w:bCs/>
+          <w:noProof/>
+        </w:rPr>
+        <w:t>–</w:t>
+      </w:r>
+      <w:r>
+        <w:rPr>
+          <w:b/>
+          <w:bCs/>
+          <w:noProof/>
+        </w:rPr>
+        <w:t xml:space="preserve"> Admin</w:t>
+      </w:r>
+    </w:p>
+    <w:p>
+      <w:pPr>
+        <w:pStyle w:val="small"/>
+        <w:numPr>
+          <w:ilvl w:val="0"/>
+          <w:numId w:val="12"/>
+        </w:numPr>
+        <w:shd w:val="clear" w:color="auto" w:fill="FFFFFF"/>
+        <w:spacing w:before="0" w:beforeAutospacing="0"/>
+        <w:rPr>
+          <w:rFonts w:asciiTheme="minorHAnsi" w:hAnsiTheme="minorHAnsi" w:cstheme="minorHAnsi"/>
+          <w:color w:val="1E293B"/>
+          <w:sz w:val="22"/>
+          <w:szCs w:val="22"/>
+        </w:rPr>
+      </w:pPr>
+      <w:r>
+        <w:rPr>
+          <w:rFonts w:asciiTheme="minorHAnsi" w:hAnsiTheme="minorHAnsi" w:cstheme="minorHAnsi"/>
+          <w:color w:val="1E293B"/>
+          <w:sz w:val="22"/>
+          <w:szCs w:val="22"/>
+        </w:rPr>
+        <w:t>Created a separate administrative interface for managing the La-Fierce famous successful people.</w:t>
+      </w:r>
+    </w:p>
+    <w:p>
+      <w:pPr>
+        <w:pStyle w:val="NormalWeb"/>
+        <w:numPr>
+          <w:ilvl w:val="0"/>
+          <w:numId w:val="12"/>
+        </w:numPr>
+        <w:shd w:val="clear" w:color="auto" w:fill="FFFFFF"/>
+        <w:spacing w:before="0" w:beforeAutospacing="0"/>
+        <w:rPr>
+          <w:rFonts w:asciiTheme="minorHAnsi" w:hAnsiTheme="minorHAnsi" w:cstheme="minorHAnsi"/>
+          <w:color w:val="1E293B"/>
+          <w:sz w:val="22"/>
+          <w:szCs w:val="22"/>
+        </w:rPr>
+      </w:pPr>
+      <w:r>
+        <w:rPr>
+          <w:rFonts w:asciiTheme="minorHAnsi" w:hAnsiTheme="minorHAnsi" w:cstheme="minorHAnsi"/>
+          <w:color w:val="1E293B"/>
+          <w:sz w:val="22"/>
+          <w:szCs w:val="22"/>
+        </w:rPr>
+        <w:t>Platform: Windows Forms C#, Android &amp; Website</w:t>
+      </w:r>
+    </w:p>
+    <w:p>
+      <w:pPr>
+        <w:pStyle w:val="small"/>
+        <w:numPr>
+          <w:ilvl w:val="0"/>
+          <w:numId w:val="12"/>
+        </w:numPr>
+        <w:shd w:val="clear" w:color="auto" w:fill="FFFFFF"/>
+        <w:spacing w:before="0" w:beforeAutospacing="0" w:after="0" w:afterAutospacing="0"/>
+        <w:rPr>
+          <w:rFonts w:asciiTheme="minorHAnsi" w:hAnsiTheme="minorHAnsi" w:cstheme="minorHAnsi"/>
+          <w:color w:val="1E293B"/>
+          <w:sz w:val="22"/>
+          <w:szCs w:val="22"/>
+        </w:rPr>
+      </w:pPr>
+      <w:r>
+        <w:rPr>
+          <w:rFonts w:asciiTheme="minorHAnsi" w:hAnsiTheme="minorHAnsi" w:cstheme="minorHAnsi"/>
+          <w:color w:val="1E293B"/>
+          <w:sz w:val="22"/>
+          <w:szCs w:val="22"/>
+        </w:rPr>
+        <w:t>Technologies: Windows Forms C#, Android Studio, React JS</w:t>
+      </w:r>
+    </w:p>
+    <w:p>
+      <w:pPr>
         <w:ind w:left="720"/>
         <w:rPr>
           <w:noProof/>
@@ -1946,6 +2064,82 @@
           <w:noProof/>
         </w:rPr>
         <w:t xml:space="preserve"> for product and order management.</w:t>
+      </w:r>
+    </w:p>
+    <w:p>
+      <w:pPr>
+        <w:rPr>
+          <w:noProof/>
+        </w:rPr>
+      </w:pPr>
+    </w:p>
+    <w:p>
+      <w:pPr>
+        <w:rPr>
+          <w:b/>
+          <w:bCs/>
+          <w:noProof/>
+        </w:rPr>
+      </w:pPr>
+      <w:r>
+        <w:rPr>
+          <w:b/>
+          <w:bCs/>
+          <w:noProof/>
+        </w:rPr>
+        <w:t>Other Android Applications</w:t>
+      </w:r>
+    </w:p>
+    <w:p>
+      <w:pPr>
+        <w:pStyle w:val="small"/>
+        <w:numPr>
+          <w:ilvl w:val="0"/>
+          <w:numId w:val="15"/>
+        </w:numPr>
+        <w:shd w:val="clear" w:color="auto" w:fill="FFFFFF"/>
+        <w:spacing w:before="0" w:beforeAutospacing="0"/>
+        <w:rPr>
+          <w:rFonts w:asciiTheme="minorHAnsi" w:hAnsiTheme="minorHAnsi" w:cstheme="minorHAnsi"/>
+          <w:color w:val="1E293B"/>
+          <w:sz w:val="22"/>
+          <w:szCs w:val="22"/>
+        </w:rPr>
+      </w:pPr>
+      <w:r>
+        <w:rPr>
+          <w:rFonts w:asciiTheme="minorHAnsi" w:hAnsiTheme="minorHAnsi" w:cstheme="minorHAnsi"/>
+          <w:color w:val="1E293B"/>
+          <w:sz w:val="22"/>
+          <w:szCs w:val="22"/>
+        </w:rPr>
+        <w:t>There are more 14 Android applications developed.</w:t>
+      </w:r>
+    </w:p>
+    <w:p>
+      <w:pPr>
+        <w:pStyle w:val="small"/>
+        <w:numPr>
+          <w:ilvl w:val="0"/>
+          <w:numId w:val="15"/>
+        </w:numPr>
+        <w:shd w:val="clear" w:color="auto" w:fill="FFFFFF"/>
+        <w:spacing w:before="0" w:beforeAutospacing="0" w:after="0" w:afterAutospacing="0"/>
+        <w:rPr>
+          <w:rFonts w:asciiTheme="minorHAnsi" w:hAnsiTheme="minorHAnsi" w:cstheme="minorHAnsi"/>
+          <w:color w:val="1E293B"/>
+          <w:sz w:val="22"/>
+          <w:szCs w:val="22"/>
+        </w:rPr>
+      </w:pPr>
+      <w:r>
+        <w:rPr>
+          <w:rFonts w:asciiTheme="minorHAnsi" w:hAnsiTheme="minorHAnsi" w:cstheme="minorHAnsi"/>
+          <w:color w:val="1E293B"/>
+          <w:sz w:val="22"/>
+          <w:szCs w:val="22"/>
+        </w:rPr>
+        <w:t>Technologies: Android Studio</w:t>
       </w:r>
     </w:p>
     <w:p>
@@ -4935,7 +5129,6 @@
   <w:style w:type="character" w:default="1" w:styleId="DefaultParagraphFont">
     <w:name w:val="Default Paragraph Font"/>
     <w:uiPriority w:val="1"/>
-    <w:semiHidden/>
     <w:unhideWhenUsed/>
   </w:style>
   <w:style w:type="table" w:default="1" w:styleId="TableNormal">
@@ -5024,6 +5217,46 @@
     <w:rPr>
       <w:color w:val="605E5C"/>
       <w:shd w:val="clear" w:color="auto" w:fill="E1DFDD"/>
+    </w:rPr>
+  </w:style>
+  <w:style w:type="paragraph" w:styleId="ListParagraph">
+    <w:name w:val="List Paragraph"/>
+    <w:basedOn w:val="Normal"/>
+    <w:uiPriority w:val="34"/>
+    <w:qFormat/>
+    <w:rsid w:val="006B07B7"/>
+    <w:pPr>
+      <w:ind w:left="720"/>
+      <w:contextualSpacing/>
+    </w:pPr>
+  </w:style>
+  <w:style w:type="paragraph" w:customStyle="1" w:styleId="small">
+    <w:name w:val="small"/>
+    <w:basedOn w:val="Normal"/>
+    <w:rsid w:val="006B07B7"/>
+    <w:pPr>
+      <w:spacing w:before="100" w:beforeAutospacing="1" w:after="100" w:afterAutospacing="1" w:line="240" w:lineRule="auto"/>
+    </w:pPr>
+    <w:rPr>
+      <w:rFonts w:ascii="Times New Roman" w:eastAsia="Times New Roman" w:hAnsi="Times New Roman" w:cs="Times New Roman"/>
+      <w:sz w:val="24"/>
+      <w:szCs w:val="24"/>
+    </w:rPr>
+  </w:style>
+  <w:style w:type="paragraph" w:styleId="NormalWeb">
+    <w:name w:val="Normal (Web)"/>
+    <w:basedOn w:val="Normal"/>
+    <w:uiPriority w:val="99"/>
+    <w:semiHidden/>
+    <w:unhideWhenUsed/>
+    <w:rsid w:val="006B07B7"/>
+    <w:pPr>
+      <w:spacing w:before="100" w:beforeAutospacing="1" w:after="100" w:afterAutospacing="1" w:line="240" w:lineRule="auto"/>
+    </w:pPr>
+    <w:rPr>
+      <w:rFonts w:ascii="Times New Roman" w:eastAsia="Times New Roman" w:hAnsi="Times New Roman" w:cs="Times New Roman"/>
+      <w:sz w:val="24"/>
+      <w:szCs w:val="24"/>
     </w:rPr>
   </w:style>
 </w:styles>

</xml_diff>

<commit_message>
Added new skills learned :)
</commit_message>
<xml_diff>
--- a/Resume - Christopher Lee Cajes.docx
+++ b/Resume - Christopher Lee Cajes.docx
@@ -385,6 +385,12 @@
         </w:rPr>
         <w:t>Python, Ruby on Rails</w:t>
       </w:r>
+      <w:r>
+        <w:rPr>
+          <w:noProof/>
+        </w:rPr>
+        <w:t>, Java, c++</w:t>
+      </w:r>
     </w:p>
     <w:p>
       <w:pPr>
@@ -400,6 +406,23 @@
         <w:rPr>
           <w:noProof/>
         </w:rPr>
+        <w:t>Node Js, Angular Js, Vue Js, Typescript</w:t>
+      </w:r>
+    </w:p>
+    <w:p>
+      <w:pPr>
+        <w:numPr>
+          <w:ilvl w:val="0"/>
+          <w:numId w:val="1"/>
+        </w:numPr>
+        <w:rPr>
+          <w:noProof/>
+        </w:rPr>
+      </w:pPr>
+      <w:r>
+        <w:rPr>
+          <w:noProof/>
+        </w:rPr>
         <w:t xml:space="preserve">SQL Server, MySQL, PostgreSQL, Oracle DB </w:t>
       </w:r>
     </w:p>
@@ -480,7 +503,25 @@
         <w:rPr>
           <w:noProof/>
         </w:rPr>
-        <w:t>Java and GUI Development</w:t>
+        <w:t>GUI</w:t>
+      </w:r>
+      <w:r>
+        <w:rPr>
+          <w:noProof/>
+        </w:rPr>
+        <w:t xml:space="preserve"> and Spring Boot</w:t>
+      </w:r>
+      <w:r>
+        <w:rPr>
+          <w:noProof/>
+        </w:rPr>
+        <w:t xml:space="preserve"> Development</w:t>
+      </w:r>
+      <w:r>
+        <w:rPr>
+          <w:noProof/>
+        </w:rPr>
+        <w:t xml:space="preserve"> (Java)</w:t>
       </w:r>
     </w:p>
     <w:p>
@@ -526,7 +567,19 @@
         <w:rPr>
           <w:noProof/>
         </w:rPr>
-        <w:t xml:space="preserve">HTML, CSS, Bootstrap, JavaScript, jQuery </w:t>
+        <w:t>HTML, CSS, Bootstrap,</w:t>
+      </w:r>
+      <w:r>
+        <w:rPr>
+          <w:noProof/>
+        </w:rPr>
+        <w:t xml:space="preserve"> Tailwind,</w:t>
+      </w:r>
+      <w:r>
+        <w:rPr>
+          <w:noProof/>
+        </w:rPr>
+        <w:t xml:space="preserve"> JavaScript, jQuery </w:t>
       </w:r>
     </w:p>
     <w:p>
@@ -544,6 +597,12 @@
           <w:noProof/>
         </w:rPr>
         <w:t xml:space="preserve">React JS (working knowledge) </w:t>
+      </w:r>
+      <w:r>
+        <w:rPr>
+          <w:noProof/>
+        </w:rPr>
+        <w:t>, Django (Python)</w:t>
       </w:r>
     </w:p>
     <w:p>
@@ -1852,72 +1911,6 @@
           <w:bCs/>
           <w:noProof/>
         </w:rPr>
-        <w:t>Sample Facebook Ad Website</w:t>
-      </w:r>
-    </w:p>
-    <w:p>
-      <w:pPr>
-        <w:numPr>
-          <w:ilvl w:val="0"/>
-          <w:numId w:val="13"/>
-        </w:numPr>
-        <w:rPr>
-          <w:noProof/>
-        </w:rPr>
-      </w:pPr>
-      <w:r>
-        <w:rPr>
-          <w:noProof/>
-        </w:rPr>
-        <w:t>Responsive landing page showcasing modern web design and marketing integration.</w:t>
-      </w:r>
-    </w:p>
-    <w:p>
-      <w:pPr>
-        <w:numPr>
-          <w:ilvl w:val="0"/>
-          <w:numId w:val="13"/>
-        </w:numPr>
-        <w:rPr>
-          <w:noProof/>
-        </w:rPr>
-      </w:pPr>
-      <w:r>
-        <w:rPr>
-          <w:noProof/>
-        </w:rPr>
-        <w:t xml:space="preserve">Project Link: </w:t>
-      </w:r>
-      <w:hyperlink r:id="rId9" w:tgtFrame="_blank" w:history="1">
-        <w:r>
-          <w:rPr>
-            <w:rStyle w:val="Hyperlink"/>
-            <w:noProof/>
-          </w:rPr>
-          <w:t>https://chris654cajes.github.io/magicspoonad.github.io/</w:t>
-        </w:r>
-      </w:hyperlink>
-    </w:p>
-    <w:p>
-      <w:pPr>
-        <w:ind w:left="720"/>
-        <w:rPr>
-          <w:noProof/>
-        </w:rPr>
-      </w:pPr>
-    </w:p>
-    <w:p>
-      <w:pPr>
-        <w:rPr>
-          <w:noProof/>
-        </w:rPr>
-      </w:pPr>
-      <w:r>
-        <w:rPr>
-          <w:b/>
-          <w:bCs/>
-          <w:noProof/>
-        </w:rPr>
         <w:t>Student Enrollment System – Minds That Matter Learning Center</w:t>
       </w:r>
       <w:r>
@@ -1973,97 +1966,6 @@
           <w:noProof/>
         </w:rPr>
         <w:t>Implemented student records management and enrollment workflows.</w:t>
-      </w:r>
-    </w:p>
-    <w:p>
-      <w:pPr>
-        <w:ind w:left="720"/>
-        <w:rPr>
-          <w:noProof/>
-        </w:rPr>
-      </w:pPr>
-    </w:p>
-    <w:p>
-      <w:pPr>
-        <w:rPr>
-          <w:noProof/>
-        </w:rPr>
-      </w:pPr>
-      <w:r>
-        <w:rPr>
-          <w:b/>
-          <w:bCs/>
-          <w:noProof/>
-        </w:rPr>
-        <w:t>SariKart – Online Grocery Shopping Mobile App</w:t>
-      </w:r>
-      <w:r>
-        <w:rPr>
-          <w:noProof/>
-        </w:rPr>
-        <w:t xml:space="preserve"> </w:t>
-      </w:r>
-    </w:p>
-    <w:p>
-      <w:pPr>
-        <w:numPr>
-          <w:ilvl w:val="0"/>
-          <w:numId w:val="15"/>
-        </w:numPr>
-        <w:rPr>
-          <w:noProof/>
-        </w:rPr>
-      </w:pPr>
-      <w:r>
-        <w:rPr>
-          <w:noProof/>
-        </w:rPr>
-        <w:t xml:space="preserve">Mobile application developed using </w:t>
-      </w:r>
-      <w:r>
-        <w:rPr>
-          <w:b/>
-          <w:bCs/>
-          <w:noProof/>
-        </w:rPr>
-        <w:t>Android Studio (Java)</w:t>
-      </w:r>
-      <w:r>
-        <w:rPr>
-          <w:noProof/>
-        </w:rPr>
-        <w:t>.</w:t>
-      </w:r>
-    </w:p>
-    <w:p>
-      <w:pPr>
-        <w:numPr>
-          <w:ilvl w:val="0"/>
-          <w:numId w:val="15"/>
-        </w:numPr>
-        <w:rPr>
-          <w:noProof/>
-        </w:rPr>
-      </w:pPr>
-      <w:r>
-        <w:rPr>
-          <w:noProof/>
-        </w:rPr>
-        <w:t xml:space="preserve">Backend powered by </w:t>
-      </w:r>
-      <w:r>
-        <w:rPr>
-          <w:b/>
-          <w:bCs/>
-          <w:noProof/>
-        </w:rPr>
-        <w:t>ASP.NET Web API</w:t>
-      </w:r>
-      <w:r>
-        <w:rPr>
-          <w:noProof/>
-        </w:rPr>
-        <w:t xml:space="preserve"> for product and order management.</w:t>
       </w:r>
     </w:p>
     <w:p>
@@ -2113,7 +2015,25 @@
           <w:sz w:val="22"/>
           <w:szCs w:val="22"/>
         </w:rPr>
-        <w:t>There are more 14 Android applications developed.</w:t>
+        <w:t>There are more</w:t>
+      </w:r>
+      <w:r>
+        <w:rPr>
+          <w:rFonts w:asciiTheme="minorHAnsi" w:hAnsiTheme="minorHAnsi" w:cstheme="minorHAnsi"/>
+          <w:color w:val="1E293B"/>
+          <w:sz w:val="22"/>
+          <w:szCs w:val="22"/>
+        </w:rPr>
+        <w:t xml:space="preserve"> </w:t>
+      </w:r>
+      <w:r>
+        <w:rPr>
+          <w:rFonts w:asciiTheme="minorHAnsi" w:hAnsiTheme="minorHAnsi" w:cstheme="minorHAnsi"/>
+          <w:color w:val="1E293B"/>
+          <w:sz w:val="22"/>
+          <w:szCs w:val="22"/>
+        </w:rPr>
+        <w:t>Android applications developed.</w:t>
       </w:r>
     </w:p>
     <w:p>
@@ -2184,6 +2104,14 @@
         </w:rPr>
         <w:t>http://www.my-creative-apps.somee.com/</w:t>
       </w:r>
+    </w:p>
+    <w:p>
+      <w:pPr>
+        <w:ind w:left="720"/>
+        <w:rPr>
+          <w:noProof/>
+        </w:rPr>
+      </w:pPr>
     </w:p>
     <w:p>
       <w:pPr>

</xml_diff>